<commit_message>
Reporte con acta de cierre
</commit_message>
<xml_diff>
--- a/ProjectCharter.docx
+++ b/ProjectCharter.docx
@@ -69,6 +69,7 @@
           <w:p>
             <w:pPr>
               <w:spacing w:after="240" w:line="240" w:lineRule="auto"/>
+              <w:jc w:val="both"/>
             </w:pPr>
             <w:r>
               <w:t>Como parte fundamental de sus procesos de manufactura y cumplimiento normativo, la planta Vantive Cuernavaca genera anualmente un volumen considerable de lotes de producción. Por cada uno de estos lotes se retienen muestras con el fin de realizar las revisiones periódicas anuales que garantizan la seguridad y calidad de los productos para el cuidado renal.</w:t>
@@ -77,6 +78,7 @@
           <w:p>
             <w:pPr>
               <w:spacing w:before="240" w:after="0" w:line="240" w:lineRule="auto"/>
+              <w:jc w:val="both"/>
             </w:pPr>
             <w:r>
               <w:t>Actualmente, el control y la gestión de estas muestras se llevan a cabo de manera manual mediante el uso de bitácoras físicas. Esta falta de digitalización y centralización de la información genera dificultades críticas al momento en que el área de calidad requiere localizar muestras específicas para su inspección, derivando en tiempos de búsqueda excesivos y una baja eficiencia operativa.</w:t>
@@ -140,6 +142,7 @@
           <w:p>
             <w:pPr>
               <w:spacing w:after="0" w:line="240" w:lineRule="auto"/>
+              <w:jc w:val="both"/>
             </w:pPr>
             <w:r>
               <w:t xml:space="preserve">El uso actual de bitácoras físicas representa un riesgo crítico de cumplimiento, ya que dificulta la adherencia a los principios ALCOA+ (Atribuible, Legible, Contemporáneo, Original, Exacto, además de Completo, Consistente, </w:t>
@@ -189,6 +192,7 @@
           <w:p>
             <w:pPr>
               <w:spacing w:after="0" w:line="240" w:lineRule="auto"/>
+              <w:jc w:val="both"/>
               <w:rPr>
                 <w:b/>
               </w:rPr>
@@ -211,6 +215,7 @@
           <w:p>
             <w:pPr>
               <w:spacing w:after="0" w:line="240" w:lineRule="auto"/>
+              <w:jc w:val="both"/>
             </w:pPr>
             <w:r>
               <w:t>Optimizar la trazabilidad y el control del ciclo de vida de las muestras de retención en la planta Vantive Cuernavaca, mediante la implementación de un sistema de gestión para garantizar el cumplimiento de las auditorías de calidad.</w:t>

</xml_diff>